<commit_message>
ST1: name the thresholds "ESI cutoff low" and "ESI cutoff high"
The 5-criteria rows read "cutoff low = 1.0, cutoff high = 2.5" while the
4-criteria rows above them already read "ESI cutoff = 2.0", so the same
quantity was named two ways within one column. Both forms now carry the
ESI prefix, in the variant rows and in the legend, including the
abbreviation entry that defines the scoring rule.

The longest cell grows from 52 to 54 characters against a Variant column
sized in the code for about 53, so the rendered PDF was checked rather
than assumed: both the longest 5-criteria and the longest 4-criteria
strings still set on one line, all 17 tables still sit with their legend
on one page, and the supplement is still 15 pages.
</commit_message>
<xml_diff>
--- a/manuscript/ESI manuscript supplement v12 2026.8.16_PJC.docx
+++ b/manuscript/ESI manuscript supplement v12 2026.8.16_PJC.docx
@@ -2235,7 +2235,7 @@
                 <w:rFonts w:ascii="Arial" w:hAnsi="Arial"/>
                 <w:sz w:val="20"/>
               </w:rPr>
-              <w:t>5 criteria, cutoff low = 0.5, cutoff high = 2.0</w:t>
+              <w:t>5 criteria, ESI cutoff low = 0.5, ESI cutoff high = 2.0</w:t>
             </w:r>
           </w:p>
         </w:tc>
@@ -2479,7 +2479,7 @@
                 <w:rFonts w:ascii="Arial" w:hAnsi="Arial"/>
                 <w:sz w:val="20"/>
               </w:rPr>
-              <w:t>5 criteria, cutoff low = 1.0, cutoff high = 2.5</w:t>
+              <w:t>5 criteria, ESI cutoff low = 1.0, ESI cutoff high = 2.5</w:t>
             </w:r>
           </w:p>
         </w:tc>
@@ -2724,7 +2724,7 @@
                 <w:rFonts w:ascii="Arial" w:hAnsi="Arial"/>
                 <w:sz w:val="20"/>
               </w:rPr>
-              <w:t>5 criteria, cutoff low = 1.5, cutoff high = 3.0</w:t>
+              <w:t>5 criteria, ESI cutoff low = 1.5, ESI cutoff high = 3.0</w:t>
             </w:r>
           </w:p>
         </w:tc>
@@ -2968,7 +2968,7 @@
                 <w:rFonts w:ascii="Arial" w:hAnsi="Arial"/>
                 <w:sz w:val="20"/>
               </w:rPr>
-              <w:t>5 criteria, cutoff low = 2.0, cutoff high = 3.5</w:t>
+              <w:t>5 criteria, ESI cutoff low = 2.0, ESI cutoff high = 3.5</w:t>
             </w:r>
           </w:p>
         </w:tc>
@@ -3213,7 +3213,7 @@
           <w:rFonts w:ascii="Arial" w:hAnsi="Arial"/>
           <w:sz w:val="20"/>
         </w:rPr>
-        <w:t>Ten candidate ESI-based COPD definitions were evaluated for their ability to reproduce the CT-based MD-COPD label. Each candidate is reported twice: on the full analytic cohort (n = 9,402, columns prefixed "Full") and on a held-out 20% split (n = 1,880, columns prefixed "Test") not used to derive the ESI cut-points. The cut-points were obtained from a single-variable classification tree fit to the remaining 80%, so the full-cohort columns are in-sample with respect to threshold selection and the held-out columns are the independent estimate. Definitions vary along three axes: the number of minor criteria in the panel (4 vs 5), the ESI scoring rule (single-cutoff for the 4-criteria variants, two-threshold for the 5-criteria variants), and the minor-criteria count required for the "COPD-minor" designation. Sensitivity, specificity, and Cohen's κ are reported for each definition against the CT-based MD-COPD label. The training-derived variant (5 criteria, cutoff low = 1.0, cutoff high = 2.5) is the definition used in all main text analyses.</w:t>
+        <w:t>Ten candidate ESI-based COPD definitions were evaluated for their ability to reproduce the CT-based MD-COPD label. Each candidate is reported twice: on the full analytic cohort (n = 9,402, columns prefixed "Full") and on a held-out 20% split (n = 1,880, columns prefixed "Test") not used to derive the ESI cut-points. The cut-points were obtained from a single-variable classification tree fit to the remaining 80%, so the full-cohort columns are in-sample with respect to threshold selection and the held-out columns are the independent estimate. Definitions vary along three axes: the number of minor criteria in the panel (4 vs 5), the ESI scoring rule (single-cutoff for the 4-criteria variants, two-threshold for the 5-criteria variants), and the minor-criteria count required for the "COPD-minor" designation. Sensitivity, specificity, and Cohen's κ are reported for each definition against the CT-based MD-COPD label. The training-derived variant (5 criteria, ESI cutoff low = 1.0, ESI cutoff high = 2.5) is the definition used in all main text analyses.</w:t>
       </w:r>
       <w:r>
         <w:rPr>
@@ -3228,7 +3228,7 @@
           <w:rFonts w:ascii="Arial" w:hAnsi="Arial"/>
           <w:sz w:val="20"/>
         </w:rPr>
-        <w:t>ESI, Emphysema Severity Index; CT, computed tomography; MD-COPD, multidimensional COPD; COPD, chronic obstructive pulmonary disease; N, number of participants classified as COPD by the candidate definition within the stated population; κ, Cohen's kappa coefficient; ESI cutoff, single ESI threshold above which the emphysema criterion is considered met in a 4-criteria variant; ≥N of M minor, minimum count of minor criteria (of M total) required for the COPD-minor classification; cutoff low / cutoff high, lower / upper ESI thresholds in a 5-criteria two-threshold variant (values below the low cutoff contribute zero minor criteria; low cutoff ≤ ESI &lt; high cutoff contribute one; ESI ≥ high cutoff contribute two).</w:t>
+        <w:t>ESI, Emphysema Severity Index; CT, computed tomography; MD-COPD, multidimensional COPD; COPD, chronic obstructive pulmonary disease; N, number of participants classified as COPD by the candidate definition within the stated population; κ, Cohen's kappa coefficient; ESI cutoff, single ESI threshold above which the emphysema criterion is considered met in a 4-criteria variant; ≥N of M minor, minimum count of minor criteria (of M total) required for the COPD-minor classification; ESI cutoff low / ESI cutoff high, lower / upper ESI thresholds in a 5-criteria two-threshold variant (values below the ESI cutoff low contribute zero minor criteria; ESI cutoff low ≤ ESI &lt; ESI cutoff high contribute one; ESI ≥ ESI cutoff high contribute two).</w:t>
       </w:r>
     </w:p>
     <w:tbl>

</xml_diff>